<commit_message>
Use 'tarot' instead of 'divinatory' in paper
</commit_message>
<xml_diff>
--- a/paper/tarotoo-tarot-card-meanings-dataset.docx
+++ b/paper/tarotoo-tarot-card-meanings-dataset.docx
@@ -90,7 +90,7 @@
           <w:sz w:val="21"/>
           <w:szCs w:val="21"/>
         </w:rPr>
-        <w:t xml:space="preserve">We present a complete, machine-readable dataset of tarot card meanings covering all 78 cards of the standard tarot deck (22 Major Arcana and 56 Minor Arcana) in the Rider–Waite–Smith tradition. Each card is described by 18 structured fields: identification (name, arcana, suit, numerological number), esoteric correspondences (element, planet, zodiac), divinatory content (upright and reversed keywords and meanings, love, career, mood, and spiritual contexts), a yes/no value for binary readings, and a canonical reference URL. All interpretive text was created by Tarotoo within the Rider–Waite–Smith tradition, drawing on established public-domain sources, distributed under the MIT license, and validated by continuous integration. The dataset serves as the grounding corpus for the AI-generated readings on Tarotoo.com and is designed for retrieval-augmented generation, lookup services, and computational studies of tarot symbolism. It is distributed via GitHub, Hugging Face, Kaggle, npm, PyPI, and a Model Context Protocol server for direct use by AI assistants.</w:t>
+        <w:t xml:space="preserve">We present a complete, machine-readable dataset of tarot card meanings covering all 78 cards of the standard tarot deck (22 Major Arcana and 56 Minor Arcana) in the Rider–Waite–Smith tradition. Each card is described by 18 structured fields: identification (name, arcana, suit, numerological number), esoteric correspondences (element, planet, zodiac), tarot content (upright and reversed keywords and meanings, love, career, mood, and spiritual contexts), a yes/no value for binary readings, and a canonical reference URL. All interpretive text was created by Tarotoo within the Rider–Waite–Smith tradition, drawing on established public-domain sources, distributed under the MIT license, and validated by continuous integration. The dataset serves as the grounding corpus for the AI-generated readings on Tarotoo.com and is designed for retrieval-augmented generation, lookup services, and computational studies of tarot symbolism. It is distributed via GitHub, Hugging Face, Kaggle, npm, PyPI, and a Model Context Protocol server for direct use by AI assistants.</w:t>
       </w:r>
     </w:p>
     <w:p>
@@ -123,7 +123,7 @@
           <w:sz w:val="21"/>
           <w:szCs w:val="21"/>
         </w:rPr>
-        <w:t xml:space="preserve">Large language models are increasingly used to generate tarot readings, yet they typically draw card interpretations from opaque training data, producing inconsistent and unverifiable meanings. Publishing the interpretive corpus itself — openly and in structured form — allows readings to be grounded in a fixed, inspectable source, and allows anyone to verify what an AI system was told a card means. This dataset was created for exactly that purpose: it is the published source of card meanings used by the reading engine at Tarotoo.com. Beyond its primary role, a complete and consistently structured tarot corpus is useful for lookup services, conversational agents, and quantitative study of divinatory symbolism.</w:t>
+        <w:t xml:space="preserve">Large language models are increasingly used to generate tarot readings, yet they typically draw card interpretations from opaque training data, producing inconsistent and unverifiable meanings. Publishing the interpretive corpus itself — openly and in structured form — allows readings to be grounded in a fixed, inspectable source, and allows anyone to verify what an AI system was told a card means. This dataset was created for exactly that purpose: it is the published source of card meanings used by the reading engine at Tarotoo.com. Beyond its primary role, a complete and consistently structured tarot corpus is useful for lookup services, conversational agents, and quantitative study of tarot symbolism.</w:t>
       </w:r>
     </w:p>
     <w:p>

</xml_diff>